<commit_message>
Add Project 4: GenAI Transaction Pattern Explainer
</commit_message>
<xml_diff>
--- a/Sarayu_Kotha_CV.docx
+++ b/Sarayu_Kotha_CV.docx
@@ -826,6 +826,39 @@
           <w:szCs w:val="17"/>
         </w:rPr>
         <w:t>▸  Analysed 247k+ World Bank remittance price quotes to identify what drives cross-border payment costs.</w:t>
+      </w:r>
+    </w:p>
+    <w:p>
+      <w:pPr>
+        <w:tabs>
+          <w:tab w:val="right" w:pos="10466"/>
+        </w:tabs>
+        <w:spacing w:after="0" w:before="27"/>
+      </w:pPr>
+      <w:r>
+        <w:rPr>
+          <w:rFonts w:ascii="Calibri" w:cs="Calibri" w:eastAsia="Calibri" w:hAnsi="Calibri"/>
+          <w:b/>
+          <w:bCs/>
+          <w:sz w:val="17"/>
+          <w:szCs w:val="17"/>
+        </w:rPr>
+        <w:t>GenAI Transaction Pattern Explainer</w:t>
+      </w:r>
+    </w:p>
+    <w:p>
+      <w:pPr>
+        <w:spacing w:after="20"/>
+        <w:ind w:left="200" w:hanging="200"/>
+      </w:pPr>
+      <w:r>
+        <w:rPr>
+          <w:rFonts w:ascii="Calibri" w:cs="Calibri" w:eastAsia="Calibri" w:hAnsi="Calibri"/>
+          <w:color w:val="1B3A6B"/>
+          <w:sz w:val="17"/>
+          <w:szCs w:val="17"/>
+        </w:rPr>
+        <w:t>▸  Rule-based fraud flagging + Gemini-written case notes, evaluated against 6.3M real PaySim transactions — 98% precision at the chosen threshold.</w:t>
       </w:r>
     </w:p>
     <w:p>

</xml_diff>

<commit_message>
Add Project 5: Global Markets & Macro Dashboard
</commit_message>
<xml_diff>
--- a/Sarayu_Kotha_CV.docx
+++ b/Sarayu_Kotha_CV.docx
@@ -25,6 +25,7 @@
         <w:jc w:val="center"/>
       </w:pPr>
       <w:bookmarkStart w:id="0" w:name="_Int_C4PGkF2y"/>
+      <w:proofErr w:type="gramStart"/>
       <w:r>
         <w:rPr>
           <w:rFonts w:ascii="Calibri" w:eastAsia="Calibri" w:hAnsi="Calibri" w:cs="Calibri"/>
@@ -36,6 +37,7 @@
         <w:t>sarayu.r.kotha@gmail.com  ·</w:t>
       </w:r>
       <w:bookmarkEnd w:id="0"/>
+      <w:proofErr w:type="gramEnd"/>
       <w:r>
         <w:rPr>
           <w:rFonts w:ascii="Calibri" w:eastAsia="Calibri" w:hAnsi="Calibri" w:cs="Calibri"/>
@@ -47,6 +49,7 @@
         <w:t xml:space="preserve">  +44 7402 </w:t>
       </w:r>
       <w:bookmarkStart w:id="1" w:name="_Int_h39LsEJt"/>
+      <w:proofErr w:type="gramStart"/>
       <w:r>
         <w:rPr>
           <w:rFonts w:ascii="Calibri" w:eastAsia="Calibri" w:hAnsi="Calibri" w:cs="Calibri"/>
@@ -58,6 +61,7 @@
         <w:t>240173  ·</w:t>
       </w:r>
       <w:bookmarkEnd w:id="1"/>
+      <w:proofErr w:type="gramEnd"/>
       <w:r>
         <w:rPr>
           <w:rFonts w:ascii="Calibri" w:eastAsia="Calibri" w:hAnsi="Calibri" w:cs="Calibri"/>
@@ -77,8 +81,20 @@
             <w:szCs w:val="16"/>
             <w:lang w:val="en-US"/>
           </w:rPr>
-          <w:t xml:space="preserve">linkedin.com/in/sarayurkotha</w:t>
+          <w:t>linkedin.com/in/</w:t>
         </w:r>
+        <w:proofErr w:type="spellStart"/>
+        <w:r>
+          <w:rPr>
+            <w:rFonts w:ascii="Calibri" w:eastAsia="Calibri" w:hAnsi="Calibri" w:cs="Calibri"/>
+            <w:color w:val="555555"/>
+            <w:sz w:val="16"/>
+            <w:szCs w:val="16"/>
+            <w:lang w:val="en-US"/>
+          </w:rPr>
+          <w:t>sarayurkotha</w:t>
+        </w:r>
+        <w:proofErr w:type="spellEnd"/>
       </w:hyperlink>
       <w:r>
         <w:rPr>
@@ -99,7 +115,7 @@
             <w:szCs w:val="16"/>
             <w:lang w:val="en-US"/>
           </w:rPr>
-          <w:t xml:space="preserve">sarayurkotha.github.io</w:t>
+          <w:t>sarayurkotha.github.io</w:t>
         </w:r>
       </w:hyperlink>
     </w:p>
@@ -196,7 +212,43 @@
           <w:szCs w:val="16"/>
           <w:lang w:val="en-US"/>
         </w:rPr>
-        <w:t xml:space="preserve">  Graduating May 2027  ·  US Citizen</w:t>
+        <w:t xml:space="preserve">  Graduating May 2027  ·  US</w:t>
+      </w:r>
+      <w:r>
+        <w:rPr>
+          <w:rFonts w:ascii="Calibri" w:eastAsia="Calibri" w:hAnsi="Calibri" w:cs="Calibri"/>
+          <w:b/>
+          <w:bCs/>
+          <w:color w:val="1B3A6B"/>
+          <w:sz w:val="16"/>
+          <w:szCs w:val="16"/>
+          <w:lang w:val="en-US"/>
+        </w:rPr>
+        <w:t xml:space="preserve"> &amp; UK</w:t>
+      </w:r>
+      <w:r>
+        <w:rPr>
+          <w:rFonts w:ascii="Calibri" w:eastAsia="Calibri" w:hAnsi="Calibri" w:cs="Calibri"/>
+          <w:b/>
+          <w:bCs/>
+          <w:color w:val="1B3A6B"/>
+          <w:sz w:val="16"/>
+          <w:szCs w:val="16"/>
+          <w:lang w:val="en-US"/>
+        </w:rPr>
+        <w:t xml:space="preserve"> Citizen</w:t>
+      </w:r>
+      <w:r>
+        <w:rPr>
+          <w:rFonts w:ascii="Calibri" w:eastAsia="Calibri" w:hAnsi="Calibri" w:cs="Calibri"/>
+          <w:b/>
+          <w:bCs/>
+          <w:color w:val="1B3A6B"/>
+          <w:sz w:val="16"/>
+          <w:szCs w:val="16"/>
+          <w:lang w:val="en-US"/>
+        </w:rPr>
+        <w:t>ship</w:t>
       </w:r>
     </w:p>
     <w:p>
@@ -227,70 +279,62 @@
       </w:r>
     </w:p>
     <w:p>
-      <w:r>
-        <w:rPr>
-          <w:rFonts w:ascii="Calibri" w:eastAsia="Calibri" w:hAnsi="Calibri" w:cs="Calibri"/>
-          <w:sz w:val="17"/>
-          <w:szCs w:val="17"/>
-          <w:lang w:val="en-US"/>
-        </w:rPr>
-        <w:t>I am</w:t>
-      </w:r>
-      <w:r>
-        <w:rPr>
-          <w:rFonts w:ascii="Calibri" w:eastAsia="Calibri" w:hAnsi="Calibri" w:cs="Calibri"/>
-          <w:sz w:val="17"/>
-          <w:szCs w:val="17"/>
-          <w:lang w:val="en-US"/>
-        </w:rPr>
-        <w:t xml:space="preserve"> going into my third year studying Economics with </w:t>
-      </w:r>
-      <w:bookmarkStart w:id="5" w:name="_Int_actEnpIV"/>
-      <w:r>
-        <w:rPr>
-          <w:rFonts w:ascii="Calibri" w:eastAsia="Calibri" w:hAnsi="Calibri" w:cs="Calibri"/>
-          <w:sz w:val="17"/>
-          <w:szCs w:val="17"/>
-          <w:lang w:val="en-US"/>
-        </w:rPr>
-        <w:t>Data</w:t>
-      </w:r>
-      <w:bookmarkEnd w:id="5"/>
-      <w:r>
-        <w:rPr>
-          <w:rFonts w:ascii="Calibri" w:eastAsia="Calibri" w:hAnsi="Calibri" w:cs="Calibri"/>
-          <w:sz w:val="17"/>
-          <w:szCs w:val="17"/>
-          <w:lang w:val="en-US"/>
-        </w:rPr>
-        <w:t xml:space="preserve"> Science student at the University of Southampton. I am drawn to the intersection of rigorous analysis and real decisions — from steering a crew of rowers to translating financial data into clear, actionable insights. My Banking Circle insight, Latham &amp; Watkins, JPMorgan, Lloyds, </w:t>
-      </w:r>
-      <w:r>
-        <w:rPr>
-          <w:rFonts w:ascii="Calibri" w:eastAsia="Calibri" w:hAnsi="Calibri" w:cs="Calibri"/>
-          <w:sz w:val="17"/>
-          <w:szCs w:val="17"/>
-          <w:lang w:val="en-US"/>
-        </w:rPr>
-        <w:t xml:space="preserve">TCS </w:t>
-      </w:r>
-      <w:r>
-        <w:rPr>
-          <w:rFonts w:ascii="Calibri" w:eastAsia="Calibri" w:hAnsi="Calibri" w:cs="Calibri"/>
-          <w:sz w:val="17"/>
-          <w:szCs w:val="17"/>
-          <w:lang w:val="en-US"/>
-        </w:rPr>
-        <w:t xml:space="preserve">and BCG simulations, alongside hands-on AI/LLM projects, have grounded me across the financial, technical, and analytical spectrum. </w:t>
-      </w:r>
-      <w:r>
-        <w:rPr>
-          <w:rFonts w:ascii="Calibri" w:eastAsia="Calibri" w:hAnsi="Calibri" w:cs="Calibri"/>
-          <w:sz w:val="17"/>
-          <w:szCs w:val="17"/>
-          <w:lang w:val="en-US"/>
-        </w:rPr>
-        <w:t>I am now looking to build a career using data to solve business problems and support informed decision-making.</w:t>
+      <w:pPr>
+        <w:rPr>
+          <w:rFonts w:ascii="Calibri" w:eastAsia="Calibri" w:hAnsi="Calibri" w:cs="Calibri"/>
+          <w:sz w:val="17"/>
+          <w:szCs w:val="17"/>
+          <w:lang w:val="en-US"/>
+        </w:rPr>
+      </w:pPr>
+      <w:r>
+        <w:rPr>
+          <w:rFonts w:ascii="Calibri" w:eastAsia="Calibri" w:hAnsi="Calibri" w:cs="Calibri"/>
+          <w:sz w:val="17"/>
+          <w:szCs w:val="17"/>
+          <w:lang w:val="en-US"/>
+        </w:rPr>
+        <w:t xml:space="preserve">Economics with Data Science undergraduate at the University of Southampton, predicted First Class and graduating May 2027. Academic foundation in economics, quantitative analysis and data science, with practical exposure through banking insight </w:t>
+      </w:r>
+      <w:proofErr w:type="spellStart"/>
+      <w:r>
+        <w:rPr>
+          <w:rFonts w:ascii="Calibri" w:eastAsia="Calibri" w:hAnsi="Calibri" w:cs="Calibri"/>
+          <w:sz w:val="17"/>
+          <w:szCs w:val="17"/>
+          <w:lang w:val="en-US"/>
+        </w:rPr>
+        <w:t>programmes</w:t>
+      </w:r>
+      <w:proofErr w:type="spellEnd"/>
+      <w:r>
+        <w:rPr>
+          <w:rFonts w:ascii="Calibri" w:eastAsia="Calibri" w:hAnsi="Calibri" w:cs="Calibri"/>
+          <w:sz w:val="17"/>
+          <w:szCs w:val="17"/>
+          <w:lang w:val="en-US"/>
+        </w:rPr>
+        <w:t xml:space="preserve">, finance and data-science job simulations, and independent AI and financial-data projects. Uses Python, R and Excel to </w:t>
+      </w:r>
+      <w:proofErr w:type="spellStart"/>
+      <w:r>
+        <w:rPr>
+          <w:rFonts w:ascii="Calibri" w:eastAsia="Calibri" w:hAnsi="Calibri" w:cs="Calibri"/>
+          <w:sz w:val="17"/>
+          <w:szCs w:val="17"/>
+          <w:lang w:val="en-US"/>
+        </w:rPr>
+        <w:t>analyse</w:t>
+      </w:r>
+      <w:proofErr w:type="spellEnd"/>
+      <w:r>
+        <w:rPr>
+          <w:rFonts w:ascii="Calibri" w:eastAsia="Calibri" w:hAnsi="Calibri" w:cs="Calibri"/>
+          <w:sz w:val="17"/>
+          <w:szCs w:val="17"/>
+          <w:lang w:val="en-US"/>
+        </w:rPr>
+        <w:t xml:space="preserve"> data and communicate findings clearly; Coxswain Captain, bringing calm judgement and leadership under pressure.</w:t>
       </w:r>
     </w:p>
     <w:p>
@@ -599,6 +643,18 @@
         </w:rPr>
         <w:t>Work Experience</w:t>
       </w:r>
+      <w:r>
+        <w:rPr>
+          <w:rFonts w:ascii="Calibri" w:eastAsia="Calibri" w:hAnsi="Calibri" w:cs="Calibri"/>
+          <w:b/>
+          <w:bCs/>
+          <w:caps/>
+          <w:color w:val="1B3A6B"/>
+          <w:sz w:val="18"/>
+          <w:szCs w:val="18"/>
+        </w:rPr>
+        <w:t xml:space="preserve"> &amp; INSIGHT PROGRAMMES</w:t>
+      </w:r>
     </w:p>
     <w:p>
       <w:pPr>
@@ -616,7 +672,31 @@
           <w:szCs w:val="17"/>
           <w:lang w:val="en-US"/>
         </w:rPr>
-        <w:t>Insight Programme, Banking Circle, London, UK</w:t>
+        <w:t xml:space="preserve">Insight </w:t>
+      </w:r>
+      <w:proofErr w:type="spellStart"/>
+      <w:r>
+        <w:rPr>
+          <w:rFonts w:ascii="Calibri" w:eastAsia="Calibri" w:hAnsi="Calibri" w:cs="Calibri"/>
+          <w:b/>
+          <w:bCs/>
+          <w:sz w:val="17"/>
+          <w:szCs w:val="17"/>
+          <w:lang w:val="en-US"/>
+        </w:rPr>
+        <w:t>Programme</w:t>
+      </w:r>
+      <w:proofErr w:type="spellEnd"/>
+      <w:r>
+        <w:rPr>
+          <w:rFonts w:ascii="Calibri" w:eastAsia="Calibri" w:hAnsi="Calibri" w:cs="Calibri"/>
+          <w:b/>
+          <w:bCs/>
+          <w:sz w:val="17"/>
+          <w:szCs w:val="17"/>
+          <w:lang w:val="en-US"/>
+        </w:rPr>
+        <w:t>, Banking Circle, London, UK</w:t>
       </w:r>
       <w:r>
         <w:rPr>
@@ -702,7 +782,31 @@
           <w:szCs w:val="17"/>
           <w:lang w:val="en-US"/>
         </w:rPr>
-        <w:t>Private Tutor, MyTutor, UK (Remote)</w:t>
+        <w:t xml:space="preserve">Private Tutor, </w:t>
+      </w:r>
+      <w:proofErr w:type="spellStart"/>
+      <w:r>
+        <w:rPr>
+          <w:rFonts w:ascii="Calibri" w:eastAsia="Calibri" w:hAnsi="Calibri" w:cs="Calibri"/>
+          <w:b/>
+          <w:bCs/>
+          <w:sz w:val="17"/>
+          <w:szCs w:val="17"/>
+          <w:lang w:val="en-US"/>
+        </w:rPr>
+        <w:t>MyTutor</w:t>
+      </w:r>
+      <w:proofErr w:type="spellEnd"/>
+      <w:r>
+        <w:rPr>
+          <w:rFonts w:ascii="Calibri" w:eastAsia="Calibri" w:hAnsi="Calibri" w:cs="Calibri"/>
+          <w:b/>
+          <w:bCs/>
+          <w:sz w:val="17"/>
+          <w:szCs w:val="17"/>
+          <w:lang w:val="en-US"/>
+        </w:rPr>
+        <w:t>, UK (Remote)</w:t>
       </w:r>
       <w:r>
         <w:rPr>
@@ -788,7 +892,31 @@
           <w:szCs w:val="17"/>
           <w:lang w:val="en-US"/>
         </w:rPr>
-        <w:t>Insight Programme, OpenText, Reading, UK</w:t>
+        <w:t xml:space="preserve">Insight </w:t>
+      </w:r>
+      <w:proofErr w:type="spellStart"/>
+      <w:r>
+        <w:rPr>
+          <w:rFonts w:ascii="Calibri" w:eastAsia="Calibri" w:hAnsi="Calibri" w:cs="Calibri"/>
+          <w:b/>
+          <w:bCs/>
+          <w:sz w:val="17"/>
+          <w:szCs w:val="17"/>
+          <w:lang w:val="en-US"/>
+        </w:rPr>
+        <w:t>Programme</w:t>
+      </w:r>
+      <w:proofErr w:type="spellEnd"/>
+      <w:r>
+        <w:rPr>
+          <w:rFonts w:ascii="Calibri" w:eastAsia="Calibri" w:hAnsi="Calibri" w:cs="Calibri"/>
+          <w:b/>
+          <w:bCs/>
+          <w:sz w:val="17"/>
+          <w:szCs w:val="17"/>
+          <w:lang w:val="en-US"/>
+        </w:rPr>
+        <w:t>, OpenText, Reading, UK</w:t>
       </w:r>
       <w:r>
         <w:rPr>
@@ -965,7 +1093,43 @@
           <w:szCs w:val="17"/>
           <w:lang w:val="en-US"/>
         </w:rPr>
-        <w:t xml:space="preserve">Job Simulation — Tata iQ via Forage  </w:t>
+        <w:t xml:space="preserve">Job Simulation — Tata </w:t>
+      </w:r>
+      <w:proofErr w:type="spellStart"/>
+      <w:r>
+        <w:rPr>
+          <w:rFonts w:ascii="Calibri" w:eastAsia="Calibri" w:hAnsi="Calibri" w:cs="Calibri"/>
+          <w:b/>
+          <w:bCs/>
+          <w:sz w:val="17"/>
+          <w:szCs w:val="17"/>
+          <w:lang w:val="en-US"/>
+        </w:rPr>
+        <w:t>iQ</w:t>
+      </w:r>
+      <w:proofErr w:type="spellEnd"/>
+      <w:r>
+        <w:rPr>
+          <w:rFonts w:ascii="Calibri" w:eastAsia="Calibri" w:hAnsi="Calibri" w:cs="Calibri"/>
+          <w:b/>
+          <w:bCs/>
+          <w:sz w:val="17"/>
+          <w:szCs w:val="17"/>
+          <w:lang w:val="en-US"/>
+        </w:rPr>
+        <w:t xml:space="preserve"> via </w:t>
+      </w:r>
+      <w:proofErr w:type="gramStart"/>
+      <w:r>
+        <w:rPr>
+          <w:rFonts w:ascii="Calibri" w:eastAsia="Calibri" w:hAnsi="Calibri" w:cs="Calibri"/>
+          <w:b/>
+          <w:bCs/>
+          <w:sz w:val="17"/>
+          <w:szCs w:val="17"/>
+          <w:lang w:val="en-US"/>
+        </w:rPr>
+        <w:t xml:space="preserve">Forage  </w:t>
       </w:r>
       <w:r>
         <w:rPr>
@@ -978,6 +1142,7 @@
         </w:rPr>
         <w:tab/>
       </w:r>
+      <w:proofErr w:type="gramEnd"/>
       <w:r>
         <w:rPr>
           <w:rFonts w:ascii="Calibri" w:eastAsia="Calibri" w:hAnsi="Calibri" w:cs="Calibri"/>
@@ -1145,7 +1310,19 @@
           <w:szCs w:val="17"/>
           <w:lang w:val="en-US"/>
         </w:rPr>
-        <w:t xml:space="preserve"> Reno, Latham &amp; Watkins via Forage  </w:t>
+        <w:t xml:space="preserve"> Reno, Latham &amp; Watkins via </w:t>
+      </w:r>
+      <w:proofErr w:type="gramStart"/>
+      <w:r>
+        <w:rPr>
+          <w:rFonts w:ascii="Calibri" w:eastAsia="Calibri" w:hAnsi="Calibri" w:cs="Calibri"/>
+          <w:b/>
+          <w:bCs/>
+          <w:sz w:val="17"/>
+          <w:szCs w:val="17"/>
+          <w:lang w:val="en-US"/>
+        </w:rPr>
+        <w:t xml:space="preserve">Forage  </w:t>
       </w:r>
       <w:r>
         <w:rPr>
@@ -1158,6 +1335,7 @@
         </w:rPr>
         <w:tab/>
       </w:r>
+      <w:proofErr w:type="gramEnd"/>
       <w:r>
         <w:rPr>
           <w:rFonts w:ascii="Calibri" w:eastAsia="Calibri" w:hAnsi="Calibri" w:cs="Calibri"/>
@@ -1409,34 +1587,16 @@
           <w:szCs w:val="17"/>
           <w:lang w:val="en-US"/>
         </w:rPr>
-        <w:t>▸ Retrieval</w:t>
-      </w:r>
-      <w:r>
-        <w:rPr>
-          <w:rFonts w:ascii="Calibri" w:eastAsia="Calibri" w:hAnsi="Calibri" w:cs="Calibri"/>
-          <w:sz w:val="17"/>
-          <w:szCs w:val="17"/>
-          <w:lang w:val="en-US"/>
-        </w:rPr>
-        <w:t xml:space="preserve">-augmented Q&amp;A system over real UK </w:t>
-      </w:r>
-      <w:r>
-        <w:rPr>
-          <w:rFonts w:ascii="Calibri" w:eastAsia="Calibri" w:hAnsi="Calibri" w:cs="Calibri"/>
-          <w:sz w:val="17"/>
-          <w:szCs w:val="17"/>
-          <w:lang w:val="en-US"/>
-        </w:rPr>
-        <w:t>regulations</w:t>
-      </w:r>
-      <w:r>
-        <w:rPr>
-          <w:rFonts w:ascii="Calibri" w:eastAsia="Calibri" w:hAnsi="Calibri" w:cs="Calibri"/>
-          <w:sz w:val="17"/>
-          <w:szCs w:val="17"/>
-          <w:lang w:val="en-US"/>
-        </w:rPr>
-        <w:t>.</w:t>
+        <w:t xml:space="preserve">▸ </w:t>
+      </w:r>
+      <w:r>
+        <w:rPr>
+          <w:rFonts w:ascii="Calibri" w:eastAsia="Calibri" w:hAnsi="Calibri" w:cs="Calibri"/>
+          <w:sz w:val="17"/>
+          <w:szCs w:val="17"/>
+          <w:lang w:val="en-US"/>
+        </w:rPr>
+        <w:t>Developed a retrieval-augmented Q&amp;A prototype over UK banking regulations, combining document retrieval with LLM-generated responses to support traceable regulatory research.</w:t>
       </w:r>
     </w:p>
     <w:p>
@@ -1518,8 +1678,21 @@
           <w:szCs w:val="17"/>
           <w:lang w:val="en-US"/>
         </w:rPr>
-        <w:t>Cross-Border Payment Cost Analyser</w:t>
-      </w:r>
+        <w:t xml:space="preserve">Cross-Border Payment Cost </w:t>
+      </w:r>
+      <w:proofErr w:type="spellStart"/>
+      <w:r>
+        <w:rPr>
+          <w:rFonts w:ascii="Calibri" w:eastAsia="Calibri" w:hAnsi="Calibri" w:cs="Calibri"/>
+          <w:b/>
+          <w:bCs/>
+          <w:sz w:val="17"/>
+          <w:szCs w:val="17"/>
+          <w:lang w:val="en-US"/>
+        </w:rPr>
+        <w:t>Analyser</w:t>
+      </w:r>
+      <w:proofErr w:type="spellEnd"/>
     </w:p>
     <w:p>
       <w:pPr>
@@ -1548,8 +1721,19 @@
           <w:szCs w:val="17"/>
           <w:lang w:val="en-US"/>
         </w:rPr>
-        <w:t xml:space="preserve"> Analysed</w:t>
-      </w:r>
+        <w:t xml:space="preserve"> </w:t>
+      </w:r>
+      <w:proofErr w:type="spellStart"/>
+      <w:r>
+        <w:rPr>
+          <w:rFonts w:ascii="Calibri" w:eastAsia="Calibri" w:hAnsi="Calibri" w:cs="Calibri"/>
+          <w:sz w:val="17"/>
+          <w:szCs w:val="17"/>
+          <w:lang w:val="en-US"/>
+        </w:rPr>
+        <w:t>Analysed</w:t>
+      </w:r>
+      <w:proofErr w:type="spellEnd"/>
       <w:r>
         <w:rPr>
           <w:rFonts w:ascii="Calibri" w:eastAsia="Calibri" w:hAnsi="Calibri" w:cs="Calibri"/>
@@ -1603,35 +1787,85 @@
           <w:szCs w:val="17"/>
           <w:lang w:val="en-US"/>
         </w:rPr>
-        <w:t>▸ Rule</w:t>
-      </w:r>
-      <w:r>
-        <w:rPr>
-          <w:rFonts w:ascii="Calibri" w:eastAsia="Calibri" w:hAnsi="Calibri" w:cs="Calibri"/>
-          <w:sz w:val="17"/>
-          <w:szCs w:val="17"/>
-          <w:lang w:val="en-US"/>
-        </w:rPr>
-        <w:t xml:space="preserve">-based fraud flagging + Gemini-written case notes, evaluated against 6.3M real PaySim </w:t>
-      </w:r>
-      <w:r>
-        <w:rPr>
-          <w:rFonts w:ascii="Calibri" w:eastAsia="Calibri" w:hAnsi="Calibri" w:cs="Calibri"/>
-          <w:sz w:val="17"/>
-          <w:szCs w:val="17"/>
-          <w:lang w:val="en-US"/>
-        </w:rPr>
-        <w:t>transactions</w:t>
-      </w:r>
-      <w:r>
-        <w:rPr>
-          <w:rFonts w:ascii="Calibri" w:eastAsia="Calibri" w:hAnsi="Calibri" w:cs="Calibri"/>
-          <w:sz w:val="17"/>
-          <w:szCs w:val="17"/>
-          <w:lang w:val="en-US"/>
-        </w:rPr>
-        <w:t>.</w:t>
-      </w:r>
+        <w:t xml:space="preserve">▸ </w:t>
+      </w:r>
+      <w:r>
+        <w:rPr>
+          <w:rFonts w:ascii="Calibri" w:eastAsia="Calibri" w:hAnsi="Calibri" w:cs="Calibri"/>
+          <w:sz w:val="17"/>
+          <w:szCs w:val="17"/>
+          <w:lang w:val="en-US"/>
+        </w:rPr>
+        <w:t xml:space="preserve">Applied rule-based fraud flagging and Gemini-generated case notes across 6.3M </w:t>
+      </w:r>
+      <w:proofErr w:type="spellStart"/>
+      <w:r>
+        <w:rPr>
+          <w:rFonts w:ascii="Calibri" w:eastAsia="Calibri" w:hAnsi="Calibri" w:cs="Calibri"/>
+          <w:sz w:val="17"/>
+          <w:szCs w:val="17"/>
+          <w:lang w:val="en-US"/>
+        </w:rPr>
+        <w:t>PaySim</w:t>
+      </w:r>
+      <w:proofErr w:type="spellEnd"/>
+      <w:r>
+        <w:rPr>
+          <w:rFonts w:ascii="Calibri" w:eastAsia="Calibri" w:hAnsi="Calibri" w:cs="Calibri"/>
+          <w:sz w:val="17"/>
+          <w:szCs w:val="17"/>
+          <w:lang w:val="en-US"/>
+        </w:rPr>
+        <w:t xml:space="preserve"> transactions to explain transaction patterns.</w:t>
+      </w:r>
+    </w:p>
+    <w:p>
+      <w:pPr>
+        <w:tabs>
+          <w:tab w:val="right" w:pos="10466"/>
+        </w:tabs>
+        <w:spacing w:before="27"/>
+        <w:rPr>
+          <w:rFonts w:ascii="Calibri" w:eastAsia="Calibri" w:hAnsi="Calibri" w:cs="Calibri"/>
+          <w:b/>
+          <w:bCs/>
+          <w:sz w:val="17"/>
+          <w:szCs w:val="17"/>
+        </w:rPr>
+      </w:pPr>
+      <w:r>
+        <w:rPr>
+          <w:rFonts w:ascii="Calibri" w:eastAsia="Calibri" w:hAnsi="Calibri" w:cs="Calibri"/>
+          <w:b/>
+          <w:bCs/>
+          <w:sz w:val="17"/>
+          <w:szCs w:val="17"/>
+        </w:rPr>
+        <w:t>Global Markets &amp; Macro Dashboard</w:t>
+      </w:r>
+    </w:p>
+    <w:p>
+      <w:pPr>
+        <w:spacing w:after="20"/>
+        <w:ind w:left="200" w:hanging="200"/>
+        <w:rPr>
+          <w:rFonts w:ascii="Calibri" w:eastAsia="Calibri" w:hAnsi="Calibri" w:cs="Calibri"/>
+          <w:sz w:val="17"/>
+          <w:szCs w:val="17"/>
+          <w:lang w:val="en-US"/>
+        </w:rPr>
+      </w:pPr>
+      <w:r>
+        <w:rPr>
+          <w:rFonts w:ascii="Calibri" w:eastAsia="Calibri" w:hAnsi="Calibri" w:cs="Calibri"/>
+          <w:sz w:val="17"/>
+          <w:szCs w:val="17"/>
+          <w:lang w:val="en-US"/>
+        </w:rPr>
+        <w:t>▸ Built an Excel model (live formulas, not pasted values) tracking 10 UK/US macro indicators since 2016; used Gemini to generate commentary from the workbook’s own computed figures.</w:t>
+      </w:r>
+      <w:proofErr w:type="spellStart"/>
+      <w:proofErr w:type="spellEnd"/>
     </w:p>
     <w:p>
       <w:pPr>
@@ -1733,11 +1967,50 @@
       <w:r>
         <w:rPr>
           <w:rFonts w:ascii="Calibri" w:eastAsia="Calibri" w:hAnsi="Calibri" w:cs="Calibri"/>
+          <w:b/>
+          <w:bCs/>
+          <w:sz w:val="17"/>
+          <w:szCs w:val="17"/>
+        </w:rPr>
+        <w:tab/>
+      </w:r>
+      <w:r>
+        <w:rPr>
+          <w:rFonts w:ascii="Calibri" w:eastAsia="Calibri" w:hAnsi="Calibri" w:cs="Calibri"/>
           <w:color w:val="555555"/>
           <w:sz w:val="16"/>
           <w:szCs w:val="16"/>
         </w:rPr>
-        <w:t xml:space="preserve">Sept 2025 </w:t>
+        <w:t xml:space="preserve">Sept </w:t>
+      </w:r>
+      <w:proofErr w:type="gramStart"/>
+      <w:r>
+        <w:rPr>
+          <w:rFonts w:ascii="Calibri" w:eastAsia="Calibri" w:hAnsi="Calibri" w:cs="Calibri"/>
+          <w:color w:val="555555"/>
+          <w:sz w:val="16"/>
+          <w:szCs w:val="16"/>
+        </w:rPr>
+        <w:t xml:space="preserve">2025 </w:t>
+      </w:r>
+      <w:r>
+        <w:rPr>
+          <w:rFonts w:ascii="Calibri" w:eastAsia="Calibri" w:hAnsi="Calibri" w:cs="Calibri"/>
+          <w:color w:val="555555"/>
+          <w:sz w:val="16"/>
+          <w:szCs w:val="16"/>
+        </w:rPr>
+        <w:t xml:space="preserve"> -</w:t>
+      </w:r>
+      <w:proofErr w:type="gramEnd"/>
+      <w:r>
+        <w:rPr>
+          <w:rFonts w:ascii="Calibri" w:eastAsia="Calibri" w:hAnsi="Calibri" w:cs="Calibri"/>
+          <w:color w:val="555555"/>
+          <w:sz w:val="16"/>
+          <w:szCs w:val="16"/>
+        </w:rPr>
+        <w:t xml:space="preserve"> Present</w:t>
       </w:r>
     </w:p>
     <w:p>
@@ -1760,15 +2033,15 @@
           <w:sz w:val="17"/>
           <w:szCs w:val="17"/>
         </w:rPr>
-        <w:t xml:space="preserve">Elected as Coxswain </w:t>
-      </w:r>
-      <w:r>
-        <w:rPr>
-          <w:rFonts w:ascii="Calibri" w:eastAsia="Calibri" w:hAnsi="Calibri" w:cs="Calibri"/>
-          <w:sz w:val="17"/>
-          <w:szCs w:val="17"/>
-        </w:rPr>
-        <w:t>Captain of the boat club in May 2026 — the most demanding cox role in the club; lead race tactics, crew safety, and real-time decisions for eight experienced rowers, building detailed race plans and post-session debriefs while managing a full academic workload.</w:t>
+        <w:t xml:space="preserve">Elected Coxswain Captain in May 2026; lead race tactics, crew safety and real-time decisions for eight rowers, producing race plans and post-session debriefs while balancing academic </w:t>
+      </w:r>
+      <w:r>
+        <w:rPr>
+          <w:rFonts w:ascii="Calibri" w:eastAsia="Calibri" w:hAnsi="Calibri" w:cs="Calibri"/>
+          <w:sz w:val="17"/>
+          <w:szCs w:val="17"/>
+        </w:rPr>
+        <w:t>commitments.</w:t>
       </w:r>
     </w:p>
     <w:p>
@@ -1927,6 +2200,24 @@
           <w:szCs w:val="17"/>
         </w:rPr>
         <w:t xml:space="preserve">Flautist   </w:t>
+      </w:r>
+      <w:r>
+        <w:rPr>
+          <w:rFonts w:ascii="Calibri" w:eastAsia="Calibri" w:hAnsi="Calibri" w:cs="Calibri"/>
+          <w:b/>
+          <w:bCs/>
+          <w:sz w:val="17"/>
+          <w:szCs w:val="17"/>
+        </w:rPr>
+        <w:tab/>
+      </w:r>
+      <w:r>
+        <w:rPr>
+          <w:rFonts w:ascii="Calibri" w:eastAsia="Calibri" w:hAnsi="Calibri" w:cs="Calibri"/>
+          <w:sz w:val="17"/>
+          <w:szCs w:val="17"/>
+        </w:rPr>
+        <w:t xml:space="preserve">Jan </w:t>
       </w:r>
       <w:r>
         <w:rPr>
@@ -2004,6 +2295,44 @@
     </w:sectPr>
   </w:body>
 </w:document>
+</file>
+
+<file path=word/endnotes.xml><?xml version="1.0" encoding="utf-8"?>
+<w:endnotes xmlns:wpc="http://schemas.microsoft.com/office/word/2010/wordprocessingCanvas" xmlns:cx="http://schemas.microsoft.com/office/drawing/2014/chartex" xmlns:cx1="http://schemas.microsoft.com/office/drawing/2015/9/8/chartex" xmlns:cx2="http://schemas.microsoft.com/office/drawing/2015/10/21/chartex" xmlns:cx3="http://schemas.microsoft.com/office/drawing/2016/5/9/chartex" xmlns:cx4="http://schemas.microsoft.com/office/drawing/2016/5/10/chartex" xmlns:cx5="http://schemas.microsoft.com/office/drawing/2016/5/11/chartex" xmlns:cx6="http://schemas.microsoft.com/office/drawing/2016/5/12/chartex" xmlns:cx7="http://schemas.microsoft.com/office/drawing/2016/5/13/chartex" xmlns:cx8="http://schemas.microsoft.com/office/drawing/2016/5/14/chartex" xmlns:mc="http://schemas.openxmlformats.org/markup-compatibility/2006" xmlns:aink="http://schemas.microsoft.com/office/drawing/2016/ink" xmlns:am3d="http://schemas.microsoft.com/office/drawing/2017/model3d" xmlns:o="urn:schemas-microsoft-com:office:office" xmlns:oel="http://schemas.microsoft.com/office/2019/extlst" xmlns:r="http://schemas.openxmlformats.org/officeDocument/2006/relationships" xmlns:m="http://schemas.openxmlformats.org/officeDocument/2006/math" xmlns:v="urn:schemas-microsoft-com:vml" xmlns:wp14="http://schemas.microsoft.com/office/word/2010/wordprocessingDrawing" xmlns:wp="http://schemas.openxmlformats.org/drawingml/2006/wordprocessingDrawing" xmlns:w10="urn:schemas-microsoft-com:office:word" xmlns:w="http://schemas.openxmlformats.org/wordprocessingml/2006/main" xmlns:w14="http://schemas.microsoft.com/office/word/2010/wordml" xmlns:w15="http://schemas.microsoft.com/office/word/2012/wordml" xmlns:w16cei="http://schemas.microsoft.com/office/word/2026/wordml/cei" xmlns:w16cex="http://schemas.microsoft.com/office/word/2018/wordml/cex" xmlns:w16cid="http://schemas.microsoft.com/office/word/2016/wordml/cid" xmlns:w16="http://schemas.microsoft.com/office/word/2018/wordml" xmlns:w16du="http://schemas.microsoft.com/office/word/2023/wordml/word16du" xmlns:w16sdtdh="http://schemas.microsoft.com/office/word/2020/wordml/sdtdatahash" xmlns:w16sdtfl="http://schemas.microsoft.com/office/word/2024/wordml/sdtformatlock" xmlns:w16se="http://schemas.microsoft.com/office/word/2015/wordml/symex" xmlns:wpg="http://schemas.microsoft.com/office/word/2010/wordprocessingGroup" xmlns:wpi="http://schemas.microsoft.com/office/word/2010/wordprocessingInk" xmlns:wne="http://schemas.microsoft.com/office/word/2006/wordml" xmlns:wps="http://schemas.microsoft.com/office/word/2010/wordprocessingShape" mc:Ignorable="w14 w15 w16se w16cid w16 w16cex w16sdtdh w16sdtfl w16du wp14">
+  <w:endnote w:type="separator" w:id="-1">
+    <w:p>
+      <w:r>
+        <w:separator/>
+      </w:r>
+    </w:p>
+  </w:endnote>
+  <w:endnote w:type="continuationSeparator" w:id="0">
+    <w:p>
+      <w:r>
+        <w:continuationSeparator/>
+      </w:r>
+    </w:p>
+  </w:endnote>
+</w:endnotes>
+</file>
+
+<file path=word/footnotes.xml><?xml version="1.0" encoding="utf-8"?>
+<w:footnotes xmlns:wpc="http://schemas.microsoft.com/office/word/2010/wordprocessingCanvas" xmlns:cx="http://schemas.microsoft.com/office/drawing/2014/chartex" xmlns:cx1="http://schemas.microsoft.com/office/drawing/2015/9/8/chartex" xmlns:cx2="http://schemas.microsoft.com/office/drawing/2015/10/21/chartex" xmlns:cx3="http://schemas.microsoft.com/office/drawing/2016/5/9/chartex" xmlns:cx4="http://schemas.microsoft.com/office/drawing/2016/5/10/chartex" xmlns:cx5="http://schemas.microsoft.com/office/drawing/2016/5/11/chartex" xmlns:cx6="http://schemas.microsoft.com/office/drawing/2016/5/12/chartex" xmlns:cx7="http://schemas.microsoft.com/office/drawing/2016/5/13/chartex" xmlns:cx8="http://schemas.microsoft.com/office/drawing/2016/5/14/chartex" xmlns:mc="http://schemas.openxmlformats.org/markup-compatibility/2006" xmlns:aink="http://schemas.microsoft.com/office/drawing/2016/ink" xmlns:am3d="http://schemas.microsoft.com/office/drawing/2017/model3d" xmlns:o="urn:schemas-microsoft-com:office:office" xmlns:oel="http://schemas.microsoft.com/office/2019/extlst" xmlns:r="http://schemas.openxmlformats.org/officeDocument/2006/relationships" xmlns:m="http://schemas.openxmlformats.org/officeDocument/2006/math" xmlns:v="urn:schemas-microsoft-com:vml" xmlns:wp14="http://schemas.microsoft.com/office/word/2010/wordprocessingDrawing" xmlns:wp="http://schemas.openxmlformats.org/drawingml/2006/wordprocessingDrawing" xmlns:w10="urn:schemas-microsoft-com:office:word" xmlns:w="http://schemas.openxmlformats.org/wordprocessingml/2006/main" xmlns:w14="http://schemas.microsoft.com/office/word/2010/wordml" xmlns:w15="http://schemas.microsoft.com/office/word/2012/wordml" xmlns:w16cei="http://schemas.microsoft.com/office/word/2026/wordml/cei" xmlns:w16cex="http://schemas.microsoft.com/office/word/2018/wordml/cex" xmlns:w16cid="http://schemas.microsoft.com/office/word/2016/wordml/cid" xmlns:w16="http://schemas.microsoft.com/office/word/2018/wordml" xmlns:w16du="http://schemas.microsoft.com/office/word/2023/wordml/word16du" xmlns:w16sdtdh="http://schemas.microsoft.com/office/word/2020/wordml/sdtdatahash" xmlns:w16sdtfl="http://schemas.microsoft.com/office/word/2024/wordml/sdtformatlock" xmlns:w16se="http://schemas.microsoft.com/office/word/2015/wordml/symex" xmlns:wpg="http://schemas.microsoft.com/office/word/2010/wordprocessingGroup" xmlns:wpi="http://schemas.microsoft.com/office/word/2010/wordprocessingInk" xmlns:wne="http://schemas.microsoft.com/office/word/2006/wordml" xmlns:wps="http://schemas.microsoft.com/office/word/2010/wordprocessingShape" mc:Ignorable="w14 w15 w16se w16cid w16 w16cex w16sdtdh w16sdtfl w16du wp14">
+  <w:footnote w:type="separator" w:id="-1">
+    <w:p>
+      <w:r>
+        <w:separator/>
+      </w:r>
+    </w:p>
+  </w:footnote>
+  <w:footnote w:type="continuationSeparator" w:id="0">
+    <w:p>
+      <w:r>
+        <w:continuationSeparator/>
+      </w:r>
+    </w:p>
+  </w:footnote>
+</w:footnotes>
 </file>
 
 <file path=word/intelligence2.xml><?xml version="1.0" encoding="utf-8"?>
@@ -2040,9 +2369,6 @@
       <int2:state int2:value="Rejected" int2:type="gram"/>
     </int2:bookmark>
     <int2:bookmark int2:bookmarkName="_Int_DiItE5uS" int2:invalidationBookmarkName="" int2:hashCode="QNn1C8OsdoVB5o" int2:id="J6ybZBfZ">
-      <int2:state int2:value="Rejected" int2:type="gram"/>
-    </int2:bookmark>
-    <int2:bookmark int2:bookmarkName="_Int_actEnpIV" int2:invalidationBookmarkName="" int2:hashCode="5eQpvMnC5KQaPH" int2:id="qDslks7t">
       <int2:state int2:value="Rejected" int2:type="gram"/>
     </int2:bookmark>
     <int2:bookmark int2:bookmarkName="_Int_x2rMhXsY" int2:invalidationBookmarkName="" int2:hashCode="7XvAj+sg60e3Vm" int2:id="hvtlvQOH">
@@ -2759,6 +3085,7 @@
   <w:style w:type="character" w:default="1" w:styleId="DefaultParagraphFont">
     <w:name w:val="Default Paragraph Font"/>
     <w:uiPriority w:val="1"/>
+    <w:semiHidden/>
     <w:unhideWhenUsed/>
   </w:style>
   <w:style w:type="table" w:default="1" w:styleId="TableNormal">
@@ -3189,4 +3516,16 @@
     </a:ext>
   </a:extLst>
 </a:theme>
+</file>
+
+<file path=customXml/item1.xml><?xml version="1.0" encoding="utf-8"?>
+<b:Sources xmlns:b="http://schemas.openxmlformats.org/officeDocument/2006/bibliography" xmlns="http://schemas.openxmlformats.org/officeDocument/2006/bibliography" SelectedStyle="\APASixthEditionOfficeOnline.xsl" StyleName="APA" Version="6"/>
+</file>
+
+<file path=customXml/itemProps1.xml><?xml version="1.0" encoding="utf-8"?>
+<ds:datastoreItem xmlns:ds="http://schemas.openxmlformats.org/officeDocument/2006/customXml" ds:itemID="{28E1CCD7-B442-4B46-A2F8-F7A3E1D31D45}">
+  <ds:schemaRefs>
+    <ds:schemaRef ds:uri="http://schemas.openxmlformats.org/officeDocument/2006/bibliography"/>
+  </ds:schemaRefs>
+</ds:datastoreItem>
 </file>
</xml_diff>